<commit_message>
chore: Adicionando link vídeo de apresentação no arquivo final
</commit_message>
<xml_diff>
--- a/doc/equipe/documentacao_final_grupo_numbeone.docx
+++ b/doc/equipe/documentacao_final_grupo_numbeone.docx
@@ -1,6 +1,6 @@
 
 <file path=word/document.xml><?xml version="1.0" encoding="utf-8"?>
-<w:document xmlns:wpc="http://schemas.microsoft.com/office/word/2010/wordprocessingCanvas" xmlns:cx="http://schemas.microsoft.com/office/drawing/2014/chartex" xmlns:cx1="http://schemas.microsoft.com/office/drawing/2015/9/8/chartex" xmlns:cx2="http://schemas.microsoft.com/office/drawing/2015/10/21/chartex" xmlns:cx3="http://schemas.microsoft.com/office/drawing/2016/5/9/chartex" xmlns:cx4="http://schemas.microsoft.com/office/drawing/2016/5/10/chartex" xmlns:cx5="http://schemas.microsoft.com/office/drawing/2016/5/11/chartex" xmlns:cx6="http://schemas.microsoft.com/office/drawing/2016/5/12/chartex" xmlns:cx7="http://schemas.microsoft.com/office/drawing/2016/5/13/chartex" xmlns:cx8="http://schemas.microsoft.com/office/drawing/2016/5/14/chartex" xmlns:mc="http://schemas.openxmlformats.org/markup-compatibility/2006" xmlns:aink="http://schemas.microsoft.com/office/drawing/2016/ink" xmlns:am3d="http://schemas.microsoft.com/office/drawing/2017/model3d" xmlns:o="urn:schemas-microsoft-com:office:office" xmlns:oel="http://schemas.microsoft.com/office/2019/extlst" xmlns:r="http://schemas.openxmlformats.org/officeDocument/2006/relationships" xmlns:m="http://schemas.openxmlformats.org/officeDocument/2006/math" xmlns:v="urn:schemas-microsoft-com:vml" xmlns:wp14="http://schemas.microsoft.com/office/word/2010/wordprocessingDrawing" xmlns:wp="http://schemas.openxmlformats.org/drawingml/2006/wordprocessingDrawing" xmlns:w10="urn:schemas-microsoft-com:office:word" xmlns:w="http://schemas.openxmlformats.org/wordprocessingml/2006/main" xmlns:w14="http://schemas.microsoft.com/office/word/2010/wordml" xmlns:w15="http://schemas.microsoft.com/office/word/2012/wordml" xmlns:w16cex="http://schemas.microsoft.com/office/word/2018/wordml/cex" xmlns:w16cid="http://schemas.microsoft.com/office/word/2016/wordml/cid" xmlns:w16="http://schemas.microsoft.com/office/word/2018/wordml" xmlns:w16du="http://schemas.microsoft.com/office/word/2023/wordml/word16du" xmlns:w16sdtdh="http://schemas.microsoft.com/office/word/2020/wordml/sdtdatahash" xmlns:w16se="http://schemas.microsoft.com/office/word/2015/wordml/symex" xmlns:wpg="http://schemas.microsoft.com/office/word/2010/wordprocessingGroup" xmlns:wpi="http://schemas.microsoft.com/office/word/2010/wordprocessingInk" xmlns:wne="http://schemas.microsoft.com/office/word/2006/wordml" xmlns:wps="http://schemas.microsoft.com/office/word/2010/wordprocessingShape" mc:Ignorable="w14 w15 w16se w16cid w16 w16cex w16sdtdh w16du wp14">
+<w:document xmlns:wpc="http://schemas.microsoft.com/office/word/2010/wordprocessingCanvas" xmlns:cx="http://schemas.microsoft.com/office/drawing/2014/chartex" xmlns:cx1="http://schemas.microsoft.com/office/drawing/2015/9/8/chartex" xmlns:cx2="http://schemas.microsoft.com/office/drawing/2015/10/21/chartex" xmlns:cx3="http://schemas.microsoft.com/office/drawing/2016/5/9/chartex" xmlns:cx4="http://schemas.microsoft.com/office/drawing/2016/5/10/chartex" xmlns:cx5="http://schemas.microsoft.com/office/drawing/2016/5/11/chartex" xmlns:cx6="http://schemas.microsoft.com/office/drawing/2016/5/12/chartex" xmlns:cx7="http://schemas.microsoft.com/office/drawing/2016/5/13/chartex" xmlns:cx8="http://schemas.microsoft.com/office/drawing/2016/5/14/chartex" xmlns:mc="http://schemas.openxmlformats.org/markup-compatibility/2006" xmlns:aink="http://schemas.microsoft.com/office/drawing/2016/ink" xmlns:am3d="http://schemas.microsoft.com/office/drawing/2017/model3d" xmlns:o="urn:schemas-microsoft-com:office:office" xmlns:oel="http://schemas.microsoft.com/office/2019/extlst" xmlns:r="http://schemas.openxmlformats.org/officeDocument/2006/relationships" xmlns:m="http://schemas.openxmlformats.org/officeDocument/2006/math" xmlns:v="urn:schemas-microsoft-com:vml" xmlns:wp14="http://schemas.microsoft.com/office/word/2010/wordprocessingDrawing" xmlns:wp="http://schemas.openxmlformats.org/drawingml/2006/wordprocessingDrawing" xmlns:w10="urn:schemas-microsoft-com:office:word" xmlns:w="http://schemas.openxmlformats.org/wordprocessingml/2006/main" xmlns:w14="http://schemas.microsoft.com/office/word/2010/wordml" xmlns:w15="http://schemas.microsoft.com/office/word/2012/wordml" xmlns:w16cex="http://schemas.microsoft.com/office/word/2018/wordml/cex" xmlns:w16cid="http://schemas.microsoft.com/office/word/2016/wordml/cid" xmlns:w16="http://schemas.microsoft.com/office/word/2018/wordml" xmlns:w16du="http://schemas.microsoft.com/office/word/2023/wordml/word16du" xmlns:w16sdtdh="http://schemas.microsoft.com/office/word/2020/wordml/sdtdatahash" xmlns:w16sdtfl="http://schemas.microsoft.com/office/word/2024/wordml/sdtformatlock" xmlns:w16se="http://schemas.microsoft.com/office/word/2015/wordml/symex" xmlns:wpg="http://schemas.microsoft.com/office/word/2010/wordprocessingGroup" xmlns:wpi="http://schemas.microsoft.com/office/word/2010/wordprocessingInk" xmlns:wne="http://schemas.microsoft.com/office/word/2006/wordml" xmlns:wps="http://schemas.microsoft.com/office/word/2010/wordprocessingShape" mc:Ignorable="w14 w15 w16se w16cid w16 w16cex w16sdtdh w16sdtfl w16du wp14">
   <w:body>
     <w:p>
       <w:pPr>
@@ -61,10 +61,7 @@
         <w:spacing w:after="280"/>
       </w:pPr>
       <w:r>
-        <w:t xml:space="preserve">Este documento consolida os itens obrigatórios da entrega final em formato estruturado, facilitando a validação do grupo, dos links de apoio e do status do relatório de </w:t>
-      </w:r>
-      <w:r>
-        <w:t>vulnerabilidades.</w:t>
+        <w:t>Este documento consolida os itens obrigatórios da entrega final em formato estruturado, facilitando a validação do grupo, dos links de apoio e do status do relatório de vulnerabilidades.</w:t>
       </w:r>
     </w:p>
     <w:p>
@@ -173,14 +170,22 @@
         </w:tc>
       </w:tr>
       <w:tr>
+        <w:trPr>
+          <w:trHeight w:val="353"/>
+        </w:trPr>
         <w:tc>
           <w:tcPr>
             <w:tcW w:w="2508" w:type="dxa"/>
           </w:tcPr>
           <w:p>
             <w:r>
-              <w:t>Nome do grupo</w:t>
+              <w:t xml:space="preserve">Nome do </w:t>
             </w:r>
+            <w:proofErr w:type="spellStart"/>
+            <w:r>
+              <w:t>grupo</w:t>
+            </w:r>
+            <w:proofErr w:type="spellEnd"/>
           </w:p>
         </w:tc>
         <w:tc>
@@ -202,8 +207,13 @@
             <w:tcW w:w="2508" w:type="dxa"/>
           </w:tcPr>
           <w:p>
+            <w:proofErr w:type="spellStart"/>
             <w:r>
-              <w:t>Participantes e usernames no Discord</w:t>
+              <w:t>Participantes</w:t>
+            </w:r>
+            <w:proofErr w:type="spellEnd"/>
+            <w:r>
+              <w:t xml:space="preserve"> e usernames no Discord</w:t>
             </w:r>
           </w:p>
         </w:tc>
@@ -277,14 +287,22 @@
         </w:tc>
       </w:tr>
       <w:tr>
+        <w:trPr>
+          <w:trHeight w:val="437"/>
+        </w:trPr>
         <w:tc>
           <w:tcPr>
             <w:tcW w:w="2508" w:type="dxa"/>
           </w:tcPr>
           <w:p>
             <w:r>
-              <w:t>Link do repositório</w:t>
+              <w:t xml:space="preserve">Link do </w:t>
             </w:r>
+            <w:proofErr w:type="spellStart"/>
+            <w:r>
+              <w:t>repositório</w:t>
+            </w:r>
+            <w:proofErr w:type="spellEnd"/>
           </w:p>
         </w:tc>
         <w:tc>
@@ -301,6 +319,41 @@
                   <w:rStyle w:val="Hyperlink"/>
                 </w:rPr>
                 <w:t>https://github.com/MarceloGilos/PosTech15SOAT</w:t>
+              </w:r>
+            </w:hyperlink>
+          </w:p>
+        </w:tc>
+      </w:tr>
+      <w:tr>
+        <w:trPr>
+          <w:trHeight w:val="614"/>
+        </w:trPr>
+        <w:tc>
+          <w:tcPr>
+            <w:tcW w:w="2508" w:type="dxa"/>
+          </w:tcPr>
+          <w:p>
+            <w:r>
+              <w:t xml:space="preserve">Link do video de </w:t>
+            </w:r>
+            <w:proofErr w:type="spellStart"/>
+            <w:r>
+              <w:t>apresentação</w:t>
+            </w:r>
+            <w:proofErr w:type="spellEnd"/>
+          </w:p>
+        </w:tc>
+        <w:tc>
+          <w:tcPr>
+            <w:tcW w:w="7356" w:type="dxa"/>
+          </w:tcPr>
+          <w:p>
+            <w:hyperlink r:id="rId10" w:history="1">
+              <w:r>
+                <w:rPr>
+                  <w:rStyle w:val="Hyperlink"/>
+                </w:rPr>
+                <w:t>https://drive.google.com/file/d/1a-E0YpHdZs_J6dx5lb86R3qjCMpAtUCn/view?usp=sharing</w:t>
               </w:r>
             </w:hyperlink>
           </w:p>
@@ -587,10 +640,7 @@
           </w:tcPr>
           <w:p>
             <w:r>
-              <w:t xml:space="preserve">Registros e orientações relacionadas à </w:t>
-            </w:r>
-            <w:r>
-              <w:t>estratégia de testes do projeto.</w:t>
+              <w:t>Registros e orientações relacionadas à estratégia de testes do projeto.</w:t>
             </w:r>
           </w:p>
         </w:tc>
@@ -824,10 +874,7 @@
           </w:tcPr>
           <w:p>
             <w:r>
-              <w:t xml:space="preserve">1 issue </w:t>
-            </w:r>
-            <w:r>
-              <w:t>aberta de confiabilidade</w:t>
+              <w:t>1 issue aberta de confiabilidade</w:t>
             </w:r>
           </w:p>
         </w:tc>
@@ -940,10 +987,7 @@
         <w:spacing w:after="40"/>
       </w:pPr>
       <w:r>
-        <w:t xml:space="preserve">• O projeto passou no Quality </w:t>
-      </w:r>
-      <w:r>
-        <w:t>Gate configurado para o ambiente local do SonarQube.</w:t>
+        <w:t>• O projeto passou no Quality Gate configurado para o ambiente local do SonarQube.</w:t>
       </w:r>
     </w:p>
     <w:p>
@@ -967,15 +1011,12 @@
         <w:spacing w:after="40"/>
       </w:pPr>
       <w:r>
-        <w:t xml:space="preserve">• Os </w:t>
-      </w:r>
-      <w:r>
-        <w:t>maiores pontos de melhoria estão em cobertura de testes, manutenibilidade e revisão da issue de confiabilidade.</w:t>
+        <w:t>• Os maiores pontos de melhoria estão em cobertura de testes, manutenibilidade e revisão da issue de confiabilidade.</w:t>
       </w:r>
     </w:p>
     <w:p/>
     <w:sectPr>
-      <w:footerReference w:type="default" r:id="rId10"/>
+      <w:footerReference w:type="default" r:id="rId11"/>
       <w:pgSz w:w="12240" w:h="15840"/>
       <w:pgMar w:top="1152" w:right="1296" w:bottom="1152" w:left="1296" w:header="720" w:footer="720" w:gutter="0"/>
       <w:cols w:space="720"/>
@@ -986,7 +1027,7 @@
 </file>
 
 <file path=word/endnotes.xml><?xml version="1.0" encoding="utf-8"?>
-<w:endnotes xmlns:wpc="http://schemas.microsoft.com/office/word/2010/wordprocessingCanvas" xmlns:cx="http://schemas.microsoft.com/office/drawing/2014/chartex" xmlns:cx1="http://schemas.microsoft.com/office/drawing/2015/9/8/chartex" xmlns:cx2="http://schemas.microsoft.com/office/drawing/2015/10/21/chartex" xmlns:cx3="http://schemas.microsoft.com/office/drawing/2016/5/9/chartex" xmlns:cx4="http://schemas.microsoft.com/office/drawing/2016/5/10/chartex" xmlns:cx5="http://schemas.microsoft.com/office/drawing/2016/5/11/chartex" xmlns:cx6="http://schemas.microsoft.com/office/drawing/2016/5/12/chartex" xmlns:cx7="http://schemas.microsoft.com/office/drawing/2016/5/13/chartex" xmlns:cx8="http://schemas.microsoft.com/office/drawing/2016/5/14/chartex" xmlns:mc="http://schemas.openxmlformats.org/markup-compatibility/2006" xmlns:aink="http://schemas.microsoft.com/office/drawing/2016/ink" xmlns:am3d="http://schemas.microsoft.com/office/drawing/2017/model3d" xmlns:o="urn:schemas-microsoft-com:office:office" xmlns:oel="http://schemas.microsoft.com/office/2019/extlst" xmlns:r="http://schemas.openxmlformats.org/officeDocument/2006/relationships" xmlns:m="http://schemas.openxmlformats.org/officeDocument/2006/math" xmlns:v="urn:schemas-microsoft-com:vml" xmlns:wp14="http://schemas.microsoft.com/office/word/2010/wordprocessingDrawing" xmlns:wp="http://schemas.openxmlformats.org/drawingml/2006/wordprocessingDrawing" xmlns:w10="urn:schemas-microsoft-com:office:word" xmlns:w="http://schemas.openxmlformats.org/wordprocessingml/2006/main" xmlns:w14="http://schemas.microsoft.com/office/word/2010/wordml" xmlns:w15="http://schemas.microsoft.com/office/word/2012/wordml" xmlns:w16cex="http://schemas.microsoft.com/office/word/2018/wordml/cex" xmlns:w16cid="http://schemas.microsoft.com/office/word/2016/wordml/cid" xmlns:w16="http://schemas.microsoft.com/office/word/2018/wordml" xmlns:w16du="http://schemas.microsoft.com/office/word/2023/wordml/word16du" xmlns:w16sdtdh="http://schemas.microsoft.com/office/word/2020/wordml/sdtdatahash" xmlns:w16se="http://schemas.microsoft.com/office/word/2015/wordml/symex" xmlns:wpg="http://schemas.microsoft.com/office/word/2010/wordprocessingGroup" xmlns:wpi="http://schemas.microsoft.com/office/word/2010/wordprocessingInk" xmlns:wne="http://schemas.microsoft.com/office/word/2006/wordml" xmlns:wps="http://schemas.microsoft.com/office/word/2010/wordprocessingShape" mc:Ignorable="w14 w15 w16se w16cid w16 w16cex w16sdtdh w16du wp14">
+<w:endnotes xmlns:wpc="http://schemas.microsoft.com/office/word/2010/wordprocessingCanvas" xmlns:cx="http://schemas.microsoft.com/office/drawing/2014/chartex" xmlns:cx1="http://schemas.microsoft.com/office/drawing/2015/9/8/chartex" xmlns:cx2="http://schemas.microsoft.com/office/drawing/2015/10/21/chartex" xmlns:cx3="http://schemas.microsoft.com/office/drawing/2016/5/9/chartex" xmlns:cx4="http://schemas.microsoft.com/office/drawing/2016/5/10/chartex" xmlns:cx5="http://schemas.microsoft.com/office/drawing/2016/5/11/chartex" xmlns:cx6="http://schemas.microsoft.com/office/drawing/2016/5/12/chartex" xmlns:cx7="http://schemas.microsoft.com/office/drawing/2016/5/13/chartex" xmlns:cx8="http://schemas.microsoft.com/office/drawing/2016/5/14/chartex" xmlns:mc="http://schemas.openxmlformats.org/markup-compatibility/2006" xmlns:aink="http://schemas.microsoft.com/office/drawing/2016/ink" xmlns:am3d="http://schemas.microsoft.com/office/drawing/2017/model3d" xmlns:o="urn:schemas-microsoft-com:office:office" xmlns:oel="http://schemas.microsoft.com/office/2019/extlst" xmlns:r="http://schemas.openxmlformats.org/officeDocument/2006/relationships" xmlns:m="http://schemas.openxmlformats.org/officeDocument/2006/math" xmlns:v="urn:schemas-microsoft-com:vml" xmlns:wp14="http://schemas.microsoft.com/office/word/2010/wordprocessingDrawing" xmlns:wp="http://schemas.openxmlformats.org/drawingml/2006/wordprocessingDrawing" xmlns:w10="urn:schemas-microsoft-com:office:word" xmlns:w="http://schemas.openxmlformats.org/wordprocessingml/2006/main" xmlns:w14="http://schemas.microsoft.com/office/word/2010/wordml" xmlns:w15="http://schemas.microsoft.com/office/word/2012/wordml" xmlns:w16cex="http://schemas.microsoft.com/office/word/2018/wordml/cex" xmlns:w16cid="http://schemas.microsoft.com/office/word/2016/wordml/cid" xmlns:w16="http://schemas.microsoft.com/office/word/2018/wordml" xmlns:w16du="http://schemas.microsoft.com/office/word/2023/wordml/word16du" xmlns:w16sdtdh="http://schemas.microsoft.com/office/word/2020/wordml/sdtdatahash" xmlns:w16sdtfl="http://schemas.microsoft.com/office/word/2024/wordml/sdtformatlock" xmlns:w16se="http://schemas.microsoft.com/office/word/2015/wordml/symex" xmlns:wpg="http://schemas.microsoft.com/office/word/2010/wordprocessingGroup" xmlns:wpi="http://schemas.microsoft.com/office/word/2010/wordprocessingInk" xmlns:wne="http://schemas.microsoft.com/office/word/2006/wordml" xmlns:wps="http://schemas.microsoft.com/office/word/2010/wordprocessingShape" mc:Ignorable="w14 w15 w16se w16cid w16 w16cex w16sdtdh w16sdtfl w16du wp14">
   <w:endnote w:type="separator" w:id="-1">
     <w:p>
       <w:pPr>
@@ -1011,7 +1052,7 @@
 </file>
 
 <file path=word/footer1.xml><?xml version="1.0" encoding="utf-8"?>
-<w:ftr xmlns:wpc="http://schemas.microsoft.com/office/word/2010/wordprocessingCanvas" xmlns:cx="http://schemas.microsoft.com/office/drawing/2014/chartex" xmlns:cx1="http://schemas.microsoft.com/office/drawing/2015/9/8/chartex" xmlns:cx2="http://schemas.microsoft.com/office/drawing/2015/10/21/chartex" xmlns:cx3="http://schemas.microsoft.com/office/drawing/2016/5/9/chartex" xmlns:cx4="http://schemas.microsoft.com/office/drawing/2016/5/10/chartex" xmlns:cx5="http://schemas.microsoft.com/office/drawing/2016/5/11/chartex" xmlns:cx6="http://schemas.microsoft.com/office/drawing/2016/5/12/chartex" xmlns:cx7="http://schemas.microsoft.com/office/drawing/2016/5/13/chartex" xmlns:cx8="http://schemas.microsoft.com/office/drawing/2016/5/14/chartex" xmlns:mc="http://schemas.openxmlformats.org/markup-compatibility/2006" xmlns:aink="http://schemas.microsoft.com/office/drawing/2016/ink" xmlns:am3d="http://schemas.microsoft.com/office/drawing/2017/model3d" xmlns:o="urn:schemas-microsoft-com:office:office" xmlns:oel="http://schemas.microsoft.com/office/2019/extlst" xmlns:r="http://schemas.openxmlformats.org/officeDocument/2006/relationships" xmlns:m="http://schemas.openxmlformats.org/officeDocument/2006/math" xmlns:v="urn:schemas-microsoft-com:vml" xmlns:wp14="http://schemas.microsoft.com/office/word/2010/wordprocessingDrawing" xmlns:wp="http://schemas.openxmlformats.org/drawingml/2006/wordprocessingDrawing" xmlns:w10="urn:schemas-microsoft-com:office:word" xmlns:w="http://schemas.openxmlformats.org/wordprocessingml/2006/main" xmlns:w14="http://schemas.microsoft.com/office/word/2010/wordml" xmlns:w15="http://schemas.microsoft.com/office/word/2012/wordml" xmlns:w16cex="http://schemas.microsoft.com/office/word/2018/wordml/cex" xmlns:w16cid="http://schemas.microsoft.com/office/word/2016/wordml/cid" xmlns:w16="http://schemas.microsoft.com/office/word/2018/wordml" xmlns:w16du="http://schemas.microsoft.com/office/word/2023/wordml/word16du" xmlns:w16sdtdh="http://schemas.microsoft.com/office/word/2020/wordml/sdtdatahash" xmlns:w16se="http://schemas.microsoft.com/office/word/2015/wordml/symex" xmlns:wpg="http://schemas.microsoft.com/office/word/2010/wordprocessingGroup" xmlns:wpi="http://schemas.microsoft.com/office/word/2010/wordprocessingInk" xmlns:wne="http://schemas.microsoft.com/office/word/2006/wordml" xmlns:wps="http://schemas.microsoft.com/office/word/2010/wordprocessingShape" mc:Ignorable="w14 w15 w16se w16cid w16 w16cex w16sdtdh w16du wp14">
+<w:ftr xmlns:wpc="http://schemas.microsoft.com/office/word/2010/wordprocessingCanvas" xmlns:cx="http://schemas.microsoft.com/office/drawing/2014/chartex" xmlns:cx1="http://schemas.microsoft.com/office/drawing/2015/9/8/chartex" xmlns:cx2="http://schemas.microsoft.com/office/drawing/2015/10/21/chartex" xmlns:cx3="http://schemas.microsoft.com/office/drawing/2016/5/9/chartex" xmlns:cx4="http://schemas.microsoft.com/office/drawing/2016/5/10/chartex" xmlns:cx5="http://schemas.microsoft.com/office/drawing/2016/5/11/chartex" xmlns:cx6="http://schemas.microsoft.com/office/drawing/2016/5/12/chartex" xmlns:cx7="http://schemas.microsoft.com/office/drawing/2016/5/13/chartex" xmlns:cx8="http://schemas.microsoft.com/office/drawing/2016/5/14/chartex" xmlns:mc="http://schemas.openxmlformats.org/markup-compatibility/2006" xmlns:aink="http://schemas.microsoft.com/office/drawing/2016/ink" xmlns:am3d="http://schemas.microsoft.com/office/drawing/2017/model3d" xmlns:o="urn:schemas-microsoft-com:office:office" xmlns:oel="http://schemas.microsoft.com/office/2019/extlst" xmlns:r="http://schemas.openxmlformats.org/officeDocument/2006/relationships" xmlns:m="http://schemas.openxmlformats.org/officeDocument/2006/math" xmlns:v="urn:schemas-microsoft-com:vml" xmlns:wp14="http://schemas.microsoft.com/office/word/2010/wordprocessingDrawing" xmlns:wp="http://schemas.openxmlformats.org/drawingml/2006/wordprocessingDrawing" xmlns:w10="urn:schemas-microsoft-com:office:word" xmlns:w="http://schemas.openxmlformats.org/wordprocessingml/2006/main" xmlns:w14="http://schemas.microsoft.com/office/word/2010/wordml" xmlns:w15="http://schemas.microsoft.com/office/word/2012/wordml" xmlns:w16cex="http://schemas.microsoft.com/office/word/2018/wordml/cex" xmlns:w16cid="http://schemas.microsoft.com/office/word/2016/wordml/cid" xmlns:w16="http://schemas.microsoft.com/office/word/2018/wordml" xmlns:w16du="http://schemas.microsoft.com/office/word/2023/wordml/word16du" xmlns:w16sdtdh="http://schemas.microsoft.com/office/word/2020/wordml/sdtdatahash" xmlns:w16sdtfl="http://schemas.microsoft.com/office/word/2024/wordml/sdtformatlock" xmlns:w16se="http://schemas.microsoft.com/office/word/2015/wordml/symex" xmlns:wpg="http://schemas.microsoft.com/office/word/2010/wordprocessingGroup" xmlns:wpi="http://schemas.microsoft.com/office/word/2010/wordprocessingInk" xmlns:wne="http://schemas.microsoft.com/office/word/2006/wordml" xmlns:wps="http://schemas.microsoft.com/office/word/2010/wordprocessingShape" mc:Ignorable="w14 w15 w16se w16cid w16 w16cex w16sdtdh w16sdtfl w16du wp14">
   <w:p>
     <w:pPr>
       <w:pStyle w:val="Rodap"/>
@@ -1038,7 +1079,7 @@
 </file>
 
 <file path=word/footnotes.xml><?xml version="1.0" encoding="utf-8"?>
-<w:footnotes xmlns:wpc="http://schemas.microsoft.com/office/word/2010/wordprocessingCanvas" xmlns:cx="http://schemas.microsoft.com/office/drawing/2014/chartex" xmlns:cx1="http://schemas.microsoft.com/office/drawing/2015/9/8/chartex" xmlns:cx2="http://schemas.microsoft.com/office/drawing/2015/10/21/chartex" xmlns:cx3="http://schemas.microsoft.com/office/drawing/2016/5/9/chartex" xmlns:cx4="http://schemas.microsoft.com/office/drawing/2016/5/10/chartex" xmlns:cx5="http://schemas.microsoft.com/office/drawing/2016/5/11/chartex" xmlns:cx6="http://schemas.microsoft.com/office/drawing/2016/5/12/chartex" xmlns:cx7="http://schemas.microsoft.com/office/drawing/2016/5/13/chartex" xmlns:cx8="http://schemas.microsoft.com/office/drawing/2016/5/14/chartex" xmlns:mc="http://schemas.openxmlformats.org/markup-compatibility/2006" xmlns:aink="http://schemas.microsoft.com/office/drawing/2016/ink" xmlns:am3d="http://schemas.microsoft.com/office/drawing/2017/model3d" xmlns:o="urn:schemas-microsoft-com:office:office" xmlns:oel="http://schemas.microsoft.com/office/2019/extlst" xmlns:r="http://schemas.openxmlformats.org/officeDocument/2006/relationships" xmlns:m="http://schemas.openxmlformats.org/officeDocument/2006/math" xmlns:v="urn:schemas-microsoft-com:vml" xmlns:wp14="http://schemas.microsoft.com/office/word/2010/wordprocessingDrawing" xmlns:wp="http://schemas.openxmlformats.org/drawingml/2006/wordprocessingDrawing" xmlns:w10="urn:schemas-microsoft-com:office:word" xmlns:w="http://schemas.openxmlformats.org/wordprocessingml/2006/main" xmlns:w14="http://schemas.microsoft.com/office/word/2010/wordml" xmlns:w15="http://schemas.microsoft.com/office/word/2012/wordml" xmlns:w16cex="http://schemas.microsoft.com/office/word/2018/wordml/cex" xmlns:w16cid="http://schemas.microsoft.com/office/word/2016/wordml/cid" xmlns:w16="http://schemas.microsoft.com/office/word/2018/wordml" xmlns:w16du="http://schemas.microsoft.com/office/word/2023/wordml/word16du" xmlns:w16sdtdh="http://schemas.microsoft.com/office/word/2020/wordml/sdtdatahash" xmlns:w16se="http://schemas.microsoft.com/office/word/2015/wordml/symex" xmlns:wpg="http://schemas.microsoft.com/office/word/2010/wordprocessingGroup" xmlns:wpi="http://schemas.microsoft.com/office/word/2010/wordprocessingInk" xmlns:wne="http://schemas.microsoft.com/office/word/2006/wordml" xmlns:wps="http://schemas.microsoft.com/office/word/2010/wordprocessingShape" mc:Ignorable="w14 w15 w16se w16cid w16 w16cex w16sdtdh w16du wp14">
+<w:footnotes xmlns:wpc="http://schemas.microsoft.com/office/word/2010/wordprocessingCanvas" xmlns:cx="http://schemas.microsoft.com/office/drawing/2014/chartex" xmlns:cx1="http://schemas.microsoft.com/office/drawing/2015/9/8/chartex" xmlns:cx2="http://schemas.microsoft.com/office/drawing/2015/10/21/chartex" xmlns:cx3="http://schemas.microsoft.com/office/drawing/2016/5/9/chartex" xmlns:cx4="http://schemas.microsoft.com/office/drawing/2016/5/10/chartex" xmlns:cx5="http://schemas.microsoft.com/office/drawing/2016/5/11/chartex" xmlns:cx6="http://schemas.microsoft.com/office/drawing/2016/5/12/chartex" xmlns:cx7="http://schemas.microsoft.com/office/drawing/2016/5/13/chartex" xmlns:cx8="http://schemas.microsoft.com/office/drawing/2016/5/14/chartex" xmlns:mc="http://schemas.openxmlformats.org/markup-compatibility/2006" xmlns:aink="http://schemas.microsoft.com/office/drawing/2016/ink" xmlns:am3d="http://schemas.microsoft.com/office/drawing/2017/model3d" xmlns:o="urn:schemas-microsoft-com:office:office" xmlns:oel="http://schemas.microsoft.com/office/2019/extlst" xmlns:r="http://schemas.openxmlformats.org/officeDocument/2006/relationships" xmlns:m="http://schemas.openxmlformats.org/officeDocument/2006/math" xmlns:v="urn:schemas-microsoft-com:vml" xmlns:wp14="http://schemas.microsoft.com/office/word/2010/wordprocessingDrawing" xmlns:wp="http://schemas.openxmlformats.org/drawingml/2006/wordprocessingDrawing" xmlns:w10="urn:schemas-microsoft-com:office:word" xmlns:w="http://schemas.openxmlformats.org/wordprocessingml/2006/main" xmlns:w14="http://schemas.microsoft.com/office/word/2010/wordml" xmlns:w15="http://schemas.microsoft.com/office/word/2012/wordml" xmlns:w16cex="http://schemas.microsoft.com/office/word/2018/wordml/cex" xmlns:w16cid="http://schemas.microsoft.com/office/word/2016/wordml/cid" xmlns:w16="http://schemas.microsoft.com/office/word/2018/wordml" xmlns:w16du="http://schemas.microsoft.com/office/word/2023/wordml/word16du" xmlns:w16sdtdh="http://schemas.microsoft.com/office/word/2020/wordml/sdtdatahash" xmlns:w16sdtfl="http://schemas.microsoft.com/office/word/2024/wordml/sdtformatlock" xmlns:w16se="http://schemas.microsoft.com/office/word/2015/wordml/symex" xmlns:wpg="http://schemas.microsoft.com/office/word/2010/wordprocessingGroup" xmlns:wpi="http://schemas.microsoft.com/office/word/2010/wordprocessingInk" xmlns:wne="http://schemas.microsoft.com/office/word/2006/wordml" xmlns:wps="http://schemas.microsoft.com/office/word/2010/wordprocessingShape" mc:Ignorable="w14 w15 w16se w16cid w16 w16cex w16sdtdh w16sdtfl w16du wp14">
   <w:footnote w:type="separator" w:id="-1">
     <w:p>
       <w:pPr>
@@ -1063,7 +1104,7 @@
 </file>
 
 <file path=word/numbering.xml><?xml version="1.0" encoding="utf-8"?>
-<w:numbering xmlns:wpc="http://schemas.microsoft.com/office/word/2010/wordprocessingCanvas" xmlns:cx="http://schemas.microsoft.com/office/drawing/2014/chartex" xmlns:cx1="http://schemas.microsoft.com/office/drawing/2015/9/8/chartex" xmlns:cx2="http://schemas.microsoft.com/office/drawing/2015/10/21/chartex" xmlns:cx3="http://schemas.microsoft.com/office/drawing/2016/5/9/chartex" xmlns:cx4="http://schemas.microsoft.com/office/drawing/2016/5/10/chartex" xmlns:cx5="http://schemas.microsoft.com/office/drawing/2016/5/11/chartex" xmlns:cx6="http://schemas.microsoft.com/office/drawing/2016/5/12/chartex" xmlns:cx7="http://schemas.microsoft.com/office/drawing/2016/5/13/chartex" xmlns:cx8="http://schemas.microsoft.com/office/drawing/2016/5/14/chartex" xmlns:mc="http://schemas.openxmlformats.org/markup-compatibility/2006" xmlns:aink="http://schemas.microsoft.com/office/drawing/2016/ink" xmlns:am3d="http://schemas.microsoft.com/office/drawing/2017/model3d" xmlns:o="urn:schemas-microsoft-com:office:office" xmlns:oel="http://schemas.microsoft.com/office/2019/extlst" xmlns:r="http://schemas.openxmlformats.org/officeDocument/2006/relationships" xmlns:m="http://schemas.openxmlformats.org/officeDocument/2006/math" xmlns:v="urn:schemas-microsoft-com:vml" xmlns:wp14="http://schemas.microsoft.com/office/word/2010/wordprocessingDrawing" xmlns:wp="http://schemas.openxmlformats.org/drawingml/2006/wordprocessingDrawing" xmlns:w10="urn:schemas-microsoft-com:office:word" xmlns:w="http://schemas.openxmlformats.org/wordprocessingml/2006/main" xmlns:w14="http://schemas.microsoft.com/office/word/2010/wordml" xmlns:w15="http://schemas.microsoft.com/office/word/2012/wordml" xmlns:w16cex="http://schemas.microsoft.com/office/word/2018/wordml/cex" xmlns:w16cid="http://schemas.microsoft.com/office/word/2016/wordml/cid" xmlns:w16="http://schemas.microsoft.com/office/word/2018/wordml" xmlns:w16du="http://schemas.microsoft.com/office/word/2023/wordml/word16du" xmlns:w16sdtdh="http://schemas.microsoft.com/office/word/2020/wordml/sdtdatahash" xmlns:w16se="http://schemas.microsoft.com/office/word/2015/wordml/symex" xmlns:wpg="http://schemas.microsoft.com/office/word/2010/wordprocessingGroup" xmlns:wpi="http://schemas.microsoft.com/office/word/2010/wordprocessingInk" xmlns:wne="http://schemas.microsoft.com/office/word/2006/wordml" xmlns:wps="http://schemas.microsoft.com/office/word/2010/wordprocessingShape" mc:Ignorable="w14 w15 w16se w16cid w16 w16cex w16sdtdh w16du wp14">
+<w:numbering xmlns:wpc="http://schemas.microsoft.com/office/word/2010/wordprocessingCanvas" xmlns:cx="http://schemas.microsoft.com/office/drawing/2014/chartex" xmlns:cx1="http://schemas.microsoft.com/office/drawing/2015/9/8/chartex" xmlns:cx2="http://schemas.microsoft.com/office/drawing/2015/10/21/chartex" xmlns:cx3="http://schemas.microsoft.com/office/drawing/2016/5/9/chartex" xmlns:cx4="http://schemas.microsoft.com/office/drawing/2016/5/10/chartex" xmlns:cx5="http://schemas.microsoft.com/office/drawing/2016/5/11/chartex" xmlns:cx6="http://schemas.microsoft.com/office/drawing/2016/5/12/chartex" xmlns:cx7="http://schemas.microsoft.com/office/drawing/2016/5/13/chartex" xmlns:cx8="http://schemas.microsoft.com/office/drawing/2016/5/14/chartex" xmlns:mc="http://schemas.openxmlformats.org/markup-compatibility/2006" xmlns:aink="http://schemas.microsoft.com/office/drawing/2016/ink" xmlns:am3d="http://schemas.microsoft.com/office/drawing/2017/model3d" xmlns:o="urn:schemas-microsoft-com:office:office" xmlns:oel="http://schemas.microsoft.com/office/2019/extlst" xmlns:r="http://schemas.openxmlformats.org/officeDocument/2006/relationships" xmlns:m="http://schemas.openxmlformats.org/officeDocument/2006/math" xmlns:v="urn:schemas-microsoft-com:vml" xmlns:wp14="http://schemas.microsoft.com/office/word/2010/wordprocessingDrawing" xmlns:wp="http://schemas.openxmlformats.org/drawingml/2006/wordprocessingDrawing" xmlns:w10="urn:schemas-microsoft-com:office:word" xmlns:w="http://schemas.openxmlformats.org/wordprocessingml/2006/main" xmlns:w14="http://schemas.microsoft.com/office/word/2010/wordml" xmlns:w15="http://schemas.microsoft.com/office/word/2012/wordml" xmlns:w16cex="http://schemas.microsoft.com/office/word/2018/wordml/cex" xmlns:w16cid="http://schemas.microsoft.com/office/word/2016/wordml/cid" xmlns:w16="http://schemas.microsoft.com/office/word/2018/wordml" xmlns:w16du="http://schemas.microsoft.com/office/word/2023/wordml/word16du" xmlns:w16sdtdh="http://schemas.microsoft.com/office/word/2020/wordml/sdtdatahash" xmlns:w16sdtfl="http://schemas.microsoft.com/office/word/2024/wordml/sdtformatlock" xmlns:w16se="http://schemas.microsoft.com/office/word/2015/wordml/symex" xmlns:wpg="http://schemas.microsoft.com/office/word/2010/wordprocessingGroup" xmlns:wpi="http://schemas.microsoft.com/office/word/2010/wordprocessingInk" xmlns:wne="http://schemas.microsoft.com/office/word/2006/wordml" xmlns:wps="http://schemas.microsoft.com/office/word/2010/wordprocessingShape" mc:Ignorable="w14 w15 w16se w16cid w16 w16cex w16sdtdh w16sdtfl w16du wp14">
   <w:abstractNum w:abstractNumId="0" w15:restartNumberingAfterBreak="0">
     <w:nsid w:val="FFFFFF7C"/>
     <w:multiLevelType w:val="singleLevel"/>
@@ -1266,7 +1307,7 @@
 </file>
 
 <file path=word/styles.xml><?xml version="1.0" encoding="utf-8"?>
-<w:styles xmlns:mc="http://schemas.openxmlformats.org/markup-compatibility/2006" xmlns:r="http://schemas.openxmlformats.org/officeDocument/2006/relationships" xmlns:w="http://schemas.openxmlformats.org/wordprocessingml/2006/main" xmlns:w14="http://schemas.microsoft.com/office/word/2010/wordml" xmlns:w15="http://schemas.microsoft.com/office/word/2012/wordml" xmlns:w16cex="http://schemas.microsoft.com/office/word/2018/wordml/cex" xmlns:w16cid="http://schemas.microsoft.com/office/word/2016/wordml/cid" xmlns:w16="http://schemas.microsoft.com/office/word/2018/wordml" xmlns:w16du="http://schemas.microsoft.com/office/word/2023/wordml/word16du" xmlns:w16sdtdh="http://schemas.microsoft.com/office/word/2020/wordml/sdtdatahash" xmlns:w16se="http://schemas.microsoft.com/office/word/2015/wordml/symex" mc:Ignorable="w14 w15 w16se w16cid w16 w16cex w16sdtdh w16du">
+<w:styles xmlns:mc="http://schemas.openxmlformats.org/markup-compatibility/2006" xmlns:r="http://schemas.openxmlformats.org/officeDocument/2006/relationships" xmlns:w="http://schemas.openxmlformats.org/wordprocessingml/2006/main" xmlns:w14="http://schemas.microsoft.com/office/word/2010/wordml" xmlns:w15="http://schemas.microsoft.com/office/word/2012/wordml" xmlns:w16cex="http://schemas.microsoft.com/office/word/2018/wordml/cex" xmlns:w16cid="http://schemas.microsoft.com/office/word/2016/wordml/cid" xmlns:w16="http://schemas.microsoft.com/office/word/2018/wordml" xmlns:w16du="http://schemas.microsoft.com/office/word/2023/wordml/word16du" xmlns:w16sdtdh="http://schemas.microsoft.com/office/word/2020/wordml/sdtdatahash" xmlns:w16sdtfl="http://schemas.microsoft.com/office/word/2024/wordml/sdtformatlock" xmlns:w16se="http://schemas.microsoft.com/office/word/2015/wordml/symex" mc:Ignorable="w14 w15 w16se w16cid w16 w16cex w16sdtdh w16sdtfl w16du">
   <w:docDefaults>
     <w:rPrDefault>
       <w:rPr>

</xml_diff>